<commit_message>
docs: fix report diagram layout topology
</commit_message>
<xml_diff>
--- a/SoftwareEngineering/generated/dorm_repair_report_compatible.docx
+++ b/SoftwareEngineering/generated/dorm_repair_report_compatible.docx
@@ -409,7 +409,7 @@
       <w:r>
         <w:drawing>
           <wp:inline xmlns:a="http://schemas.openxmlformats.org/drawingml/2006/main" xmlns:pic="http://schemas.openxmlformats.org/drawingml/2006/picture">
-            <wp:extent cx="5688000" cy="3855200"/>
+            <wp:extent cx="5688000" cy="3833217"/>
             <wp:docPr id="1" name="Picture 1"/>
             <wp:cNvGraphicFramePr>
               <a:graphicFrameLocks noChangeAspect="1"/>
@@ -430,7 +430,7 @@
                   <pic:spPr>
                     <a:xfrm>
                       <a:off x="0" y="0"/>
-                      <a:ext cx="5688000" cy="3855200"/>
+                      <a:ext cx="5688000" cy="3833217"/>
                     </a:xfrm>
                     <a:prstGeom prst="rect"/>
                   </pic:spPr>
@@ -547,7 +547,7 @@
       <w:r>
         <w:drawing>
           <wp:inline xmlns:a="http://schemas.openxmlformats.org/drawingml/2006/main" xmlns:pic="http://schemas.openxmlformats.org/drawingml/2006/picture">
-            <wp:extent cx="5760000" cy="3977143"/>
+            <wp:extent cx="5760000" cy="3876923"/>
             <wp:docPr id="3" name="Picture 3"/>
             <wp:cNvGraphicFramePr>
               <a:graphicFrameLocks noChangeAspect="1"/>
@@ -568,7 +568,7 @@
                   <pic:spPr>
                     <a:xfrm>
                       <a:off x="0" y="0"/>
-                      <a:ext cx="5760000" cy="3977143"/>
+                      <a:ext cx="5760000" cy="3876923"/>
                     </a:xfrm>
                     <a:prstGeom prst="rect"/>
                   </pic:spPr>

</xml_diff>

<commit_message>
docs: add offline final report doc
</commit_message>
<xml_diff>
--- a/SoftwareEngineering/generated/dorm_repair_report_compatible.docx
+++ b/SoftwareEngineering/generated/dorm_repair_report_compatible.docx
@@ -57,7 +57,7 @@
           <w:rFonts w:ascii="宋体" w:hAnsi="宋体" w:eastAsia="宋体"/>
           <w:sz w:val="32"/>
         </w:rPr>
-        <w:t>姓    名： ______________________</w:t>
+        <w:t>姓    名： _ _刘小麟____</w:t>
       </w:r>
     </w:p>
     <w:p>
@@ -70,7 +70,7 @@
           <w:rFonts w:ascii="宋体" w:hAnsi="宋体" w:eastAsia="宋体"/>
           <w:sz w:val="32"/>
         </w:rPr>
-        <w:t>学    号： ______________________</w:t>
+        <w:t>学    号：    2052442135</w:t>
       </w:r>
     </w:p>
     <w:p>
@@ -122,7 +122,7 @@
           <w:rFonts w:ascii="宋体" w:hAnsi="宋体" w:eastAsia="宋体"/>
           <w:sz w:val="32"/>
         </w:rPr>
-        <w:t>班    级： ___ ___________</w:t>
+        <w:t>班    级：   软件技术14班</w:t>
       </w:r>
     </w:p>
     <w:p>
@@ -151,7 +151,7 @@
           <w:b w:val="0"/>
           <w:sz w:val="28"/>
         </w:rPr>
-        <w:t>2026 年    月    日 至   2026 年   月   日</w:t>
+        <w:t>2026 年 5 月 28 日 至 2026 年 5 月 30 日</w:t>
       </w:r>
     </w:p>
     <w:p>
@@ -165,7 +165,7 @@
           <w:b w:val="0"/>
           <w:sz w:val="24"/>
         </w:rPr>
-        <w:t>所 在 单 位 ：  __         _级    系    专业    班</w:t>
+        <w:t>所 在 单 位 ： __ 2024 _级 信息工程 系 软件技术 专业 14 班</w:t>
       </w:r>
     </w:p>
     <w:p>

</xml_diff>